<commit_message>
feat: add house+land and guardianship+msk templates, integrate 2026 antifraud phone scam defense clause
</commit_message>
<xml_diff>
--- a/templates/ШАБЛОН_ДКП_Этажи_чистая_наличка_с_осмотром_и_распиской.docx
+++ b/templates/ШАБЛОН_ДКП_Этажи_чистая_наличка_с_осмотром_и_распиской.docx
@@ -585,6 +585,28 @@
       </w:pPr>
       <w:r>
         <w:t>5.6. Стороны подтверждают свою дееспособность, отсутствие факторов, вынуждающих совершить сделку на крайне невыгодных для себя условиях (некабальность сделки).</w:t>
+      </w:r>
+    </w:p>
+    <w:p>
+      <w:pPr>
+        <w:spacing w:after="80" w:line="276" w:lineRule="auto"/>
+        <w:ind w:firstLine="504"/>
+        <w:jc w:val="both"/>
+      </w:pPr>
+      <w:r>
+        <w:rPr>
+          <w:rFonts w:ascii="Times New Roman" w:hAnsi="Times New Roman"/>
+          <w:b/>
+          <w:sz w:val="20"/>
+        </w:rPr>
+        <w:t xml:space="preserve">5.7. ЗАЩИТА ОТ ТЕЛЕФОННОГО МОШЕННИЧЕСТВА: </w:t>
+      </w:r>
+      <w:r>
+        <w:rPr>
+          <w:rFonts w:ascii="Times New Roman" w:hAnsi="Times New Roman"/>
+          <w:sz w:val="20"/>
+        </w:rPr>
+        <w:t>Продавец заверяет Покупателя о том, что заключение Продавцом настоящего Договора не связано с введением его в заблуждение или обманом со стороны третьих лиц, в том числе о том, что Продавец якобы является участником какой-либо специальной операции или следственных действий, проводимых правоохранительными органами РФ, Федеральной службой безопасности РФ (ФСБ), Центральным банком РФ (Банком России) или иными государственными службами. Договор заключается Продавцом с реальным, свободным и осознанным намерением на отчуждение Объекта и получение денежных средств. С Продавцом не связывались никакие третьи лица и не склоняли его к заключению настоящего Договора в целях содействия государственным органам либо перевода вырученных средств на безопасные или специальные счета. Продавец гарантирует, что не намерен передавать вырученные денежные средства третьим лицам под влиянием подобных указаний. Если указанные обстоятельства имели место, но были скрыты Продавцом от Покупателя, Продавец не вправе в будущем ссылаться на них как на основания недействительности сделки по статьям 178, 179 Гражданского кодекса РФ (ст. 431.2 ГК РФ).</w:t>
       </w:r>
     </w:p>
     <w:p>

</xml_diff>